<commit_message>
Switch action list to tick boxes and a modern sans
Replace the action numbering with tick boxes so the list can be marked off
during the walk-round, and move the typeface to Aptos (Aptos Display for the
title). Lay the close-out sign-off fields out side by side rather than
stacked, keeping the whole checklist on one page.

Co-Authored-By: Claude Opus 5 <noreply@anthropic.com>
Claude-Session: https://claude.ai/code/session_01FpsGqGN1EaS9r7pD8jv17k
</commit_message>
<xml_diff>
--- a/output/hs-inspection-actions.docx
+++ b/output/hs-inspection-actions.docx
@@ -47,7 +47,7 @@
       </w:pPr>
       <w:r>
         <w:rPr>
-          <w:rFonts w:ascii="Arial" w:hAnsi="Arial" w:cs="Arial"/>
+          <w:rFonts w:ascii="Aptos Display" w:hAnsi="Aptos Display" w:cs="Aptos Display"/>
           <w:b/>
           <w:color w:val="000000"/>
           <w:sz w:val="40"/>
@@ -64,7 +64,7 @@
       </w:pPr>
       <w:r>
         <w:rPr>
-          <w:rFonts w:ascii="Arial" w:hAnsi="Arial" w:cs="Arial"/>
+          <w:rFonts w:ascii="Aptos" w:hAnsi="Aptos" w:cs="Aptos"/>
           <w:b/>
           <w:color w:val="002516"/>
           <w:sz w:val="24"/>
@@ -78,7 +78,7 @@
       </w:pPr>
       <w:r>
         <w:rPr>
-          <w:rFonts w:ascii="Arial" w:hAnsi="Arial" w:cs="Arial"/>
+          <w:rFonts w:ascii="Aptos" w:hAnsi="Aptos" w:cs="Aptos"/>
           <w:color w:val="002516"/>
           <w:sz w:val="21"/>
         </w:rPr>
@@ -94,7 +94,7 @@
       </w:pPr>
       <w:r>
         <w:rPr>
-          <w:rFonts w:ascii="Arial" w:hAnsi="Arial" w:cs="Arial"/>
+          <w:rFonts w:ascii="Aptos" w:hAnsi="Aptos" w:cs="Aptos"/>
           <w:b/>
           <w:color w:val="002516"/>
           <w:sz w:val="18"/>
@@ -103,7 +103,7 @@
       </w:r>
       <w:r>
         <w:rPr>
-          <w:rFonts w:ascii="Arial" w:hAnsi="Arial" w:cs="Arial"/>
+          <w:rFonts w:ascii="Aptos" w:hAnsi="Aptos" w:cs="Aptos"/>
           <w:color w:val="000000"/>
           <w:sz w:val="18"/>
         </w:rPr>
@@ -119,7 +119,7 @@
       </w:pPr>
       <w:r>
         <w:rPr>
-          <w:rFonts w:ascii="Arial" w:hAnsi="Arial" w:cs="Arial"/>
+          <w:rFonts w:ascii="Aptos" w:hAnsi="Aptos" w:cs="Aptos"/>
           <w:b/>
           <w:i w:val="0"/>
           <w:color w:val="002516"/>
@@ -131,24 +131,28 @@
     <w:p>
       <w:pPr>
         <w:tabs>
-          <w:tab w:pos="539" w:val="left"/>
+          <w:tab w:pos="482" w:val="left"/>
         </w:tabs>
-        <w:spacing w:before="80" w:after="80"/>
-        <w:ind w:left="539" w:hanging="539"/>
+        <w:spacing w:before="100" w:after="100"/>
+        <w:ind w:left="482" w:hanging="482"/>
       </w:pPr>
       <w:r>
         <w:rPr>
-          <w:rFonts w:ascii="Arial" w:hAnsi="Arial" w:cs="Arial"/>
-          <w:b/>
-          <w:color w:val="C62026"/>
-          <w:sz w:val="20"/>
+          <w:rFonts w:ascii="Segoe UI Symbol" w:hAnsi="Segoe UI Symbol" w:cs="Segoe UI Symbol"/>
+          <w:color w:val="002516"/>
+          <w:sz w:val="28"/>
         </w:rPr>
-        <w:t>1.</w:t>
+        <w:t>☐</w:t>
+      </w:r>
+      <w:r>
+        <w:rPr>
+          <w:rFonts w:ascii="Aptos" w:hAnsi="Aptos" w:cs="Aptos"/>
+        </w:rPr>
         <w:tab/>
       </w:r>
       <w:r>
         <w:rPr>
-          <w:rFonts w:ascii="Book Antiqua" w:hAnsi="Book Antiqua" w:cs="Book Antiqua"/>
+          <w:rFonts w:ascii="Aptos" w:hAnsi="Aptos" w:cs="Aptos"/>
           <w:b/>
           <w:i w:val="0"/>
         </w:rPr>
@@ -156,7 +160,7 @@
       </w:r>
       <w:r>
         <w:rPr>
-          <w:rFonts w:ascii="Book Antiqua" w:hAnsi="Book Antiqua" w:cs="Book Antiqua"/>
+          <w:rFonts w:ascii="Aptos" w:hAnsi="Aptos" w:cs="Aptos"/>
           <w:b w:val="0"/>
           <w:i w:val="0"/>
         </w:rPr>
@@ -166,24 +170,28 @@
     <w:p>
       <w:pPr>
         <w:tabs>
-          <w:tab w:pos="539" w:val="left"/>
+          <w:tab w:pos="482" w:val="left"/>
         </w:tabs>
-        <w:spacing w:before="80" w:after="80"/>
-        <w:ind w:left="539" w:hanging="539"/>
+        <w:spacing w:before="100" w:after="100"/>
+        <w:ind w:left="482" w:hanging="482"/>
       </w:pPr>
       <w:r>
         <w:rPr>
-          <w:rFonts w:ascii="Arial" w:hAnsi="Arial" w:cs="Arial"/>
-          <w:b/>
-          <w:color w:val="C62026"/>
-          <w:sz w:val="20"/>
+          <w:rFonts w:ascii="Segoe UI Symbol" w:hAnsi="Segoe UI Symbol" w:cs="Segoe UI Symbol"/>
+          <w:color w:val="002516"/>
+          <w:sz w:val="28"/>
         </w:rPr>
-        <w:t>2.</w:t>
+        <w:t>☐</w:t>
+      </w:r>
+      <w:r>
+        <w:rPr>
+          <w:rFonts w:ascii="Aptos" w:hAnsi="Aptos" w:cs="Aptos"/>
+        </w:rPr>
         <w:tab/>
       </w:r>
       <w:r>
         <w:rPr>
-          <w:rFonts w:ascii="Book Antiqua" w:hAnsi="Book Antiqua" w:cs="Book Antiqua"/>
+          <w:rFonts w:ascii="Aptos" w:hAnsi="Aptos" w:cs="Aptos"/>
           <w:b/>
           <w:i w:val="0"/>
         </w:rPr>
@@ -191,7 +199,7 @@
       </w:r>
       <w:r>
         <w:rPr>
-          <w:rFonts w:ascii="Book Antiqua" w:hAnsi="Book Antiqua" w:cs="Book Antiqua"/>
+          <w:rFonts w:ascii="Aptos" w:hAnsi="Aptos" w:cs="Aptos"/>
           <w:b w:val="0"/>
           <w:i w:val="0"/>
         </w:rPr>
@@ -201,24 +209,28 @@
     <w:p>
       <w:pPr>
         <w:tabs>
-          <w:tab w:pos="539" w:val="left"/>
+          <w:tab w:pos="482" w:val="left"/>
         </w:tabs>
-        <w:spacing w:before="80" w:after="80"/>
-        <w:ind w:left="539" w:hanging="539"/>
+        <w:spacing w:before="100" w:after="100"/>
+        <w:ind w:left="482" w:hanging="482"/>
       </w:pPr>
       <w:r>
         <w:rPr>
-          <w:rFonts w:ascii="Arial" w:hAnsi="Arial" w:cs="Arial"/>
-          <w:b/>
-          <w:color w:val="C62026"/>
-          <w:sz w:val="20"/>
+          <w:rFonts w:ascii="Segoe UI Symbol" w:hAnsi="Segoe UI Symbol" w:cs="Segoe UI Symbol"/>
+          <w:color w:val="002516"/>
+          <w:sz w:val="28"/>
         </w:rPr>
-        <w:t>3.</w:t>
+        <w:t>☐</w:t>
+      </w:r>
+      <w:r>
+        <w:rPr>
+          <w:rFonts w:ascii="Aptos" w:hAnsi="Aptos" w:cs="Aptos"/>
+        </w:rPr>
         <w:tab/>
       </w:r>
       <w:r>
         <w:rPr>
-          <w:rFonts w:ascii="Book Antiqua" w:hAnsi="Book Antiqua" w:cs="Book Antiqua"/>
+          <w:rFonts w:ascii="Aptos" w:hAnsi="Aptos" w:cs="Aptos"/>
           <w:b/>
           <w:i w:val="0"/>
         </w:rPr>
@@ -226,7 +238,7 @@
       </w:r>
       <w:r>
         <w:rPr>
-          <w:rFonts w:ascii="Book Antiqua" w:hAnsi="Book Antiqua" w:cs="Book Antiqua"/>
+          <w:rFonts w:ascii="Aptos" w:hAnsi="Aptos" w:cs="Aptos"/>
           <w:b w:val="0"/>
           <w:i w:val="0"/>
         </w:rPr>
@@ -236,24 +248,28 @@
     <w:p>
       <w:pPr>
         <w:tabs>
-          <w:tab w:pos="539" w:val="left"/>
+          <w:tab w:pos="482" w:val="left"/>
         </w:tabs>
-        <w:spacing w:before="80" w:after="80"/>
-        <w:ind w:left="539" w:hanging="539"/>
+        <w:spacing w:before="100" w:after="100"/>
+        <w:ind w:left="482" w:hanging="482"/>
       </w:pPr>
       <w:r>
         <w:rPr>
-          <w:rFonts w:ascii="Arial" w:hAnsi="Arial" w:cs="Arial"/>
-          <w:b/>
-          <w:color w:val="C62026"/>
-          <w:sz w:val="20"/>
+          <w:rFonts w:ascii="Segoe UI Symbol" w:hAnsi="Segoe UI Symbol" w:cs="Segoe UI Symbol"/>
+          <w:color w:val="002516"/>
+          <w:sz w:val="28"/>
         </w:rPr>
-        <w:t>4.</w:t>
+        <w:t>☐</w:t>
+      </w:r>
+      <w:r>
+        <w:rPr>
+          <w:rFonts w:ascii="Aptos" w:hAnsi="Aptos" w:cs="Aptos"/>
+        </w:rPr>
         <w:tab/>
       </w:r>
       <w:r>
         <w:rPr>
-          <w:rFonts w:ascii="Book Antiqua" w:hAnsi="Book Antiqua" w:cs="Book Antiqua"/>
+          <w:rFonts w:ascii="Aptos" w:hAnsi="Aptos" w:cs="Aptos"/>
           <w:b/>
           <w:i w:val="0"/>
         </w:rPr>
@@ -261,7 +277,7 @@
       </w:r>
       <w:r>
         <w:rPr>
-          <w:rFonts w:ascii="Book Antiqua" w:hAnsi="Book Antiqua" w:cs="Book Antiqua"/>
+          <w:rFonts w:ascii="Aptos" w:hAnsi="Aptos" w:cs="Aptos"/>
           <w:b w:val="0"/>
           <w:i w:val="0"/>
         </w:rPr>
@@ -271,24 +287,28 @@
     <w:p>
       <w:pPr>
         <w:tabs>
-          <w:tab w:pos="539" w:val="left"/>
+          <w:tab w:pos="482" w:val="left"/>
         </w:tabs>
-        <w:spacing w:before="80" w:after="80"/>
-        <w:ind w:left="539" w:hanging="539"/>
+        <w:spacing w:before="100" w:after="100"/>
+        <w:ind w:left="482" w:hanging="482"/>
       </w:pPr>
       <w:r>
         <w:rPr>
-          <w:rFonts w:ascii="Arial" w:hAnsi="Arial" w:cs="Arial"/>
-          <w:b/>
-          <w:color w:val="C62026"/>
-          <w:sz w:val="20"/>
+          <w:rFonts w:ascii="Segoe UI Symbol" w:hAnsi="Segoe UI Symbol" w:cs="Segoe UI Symbol"/>
+          <w:color w:val="002516"/>
+          <w:sz w:val="28"/>
         </w:rPr>
-        <w:t>5.</w:t>
+        <w:t>☐</w:t>
+      </w:r>
+      <w:r>
+        <w:rPr>
+          <w:rFonts w:ascii="Aptos" w:hAnsi="Aptos" w:cs="Aptos"/>
+        </w:rPr>
         <w:tab/>
       </w:r>
       <w:r>
         <w:rPr>
-          <w:rFonts w:ascii="Book Antiqua" w:hAnsi="Book Antiqua" w:cs="Book Antiqua"/>
+          <w:rFonts w:ascii="Aptos" w:hAnsi="Aptos" w:cs="Aptos"/>
           <w:b/>
           <w:i w:val="0"/>
         </w:rPr>
@@ -296,7 +316,7 @@
       </w:r>
       <w:r>
         <w:rPr>
-          <w:rFonts w:ascii="Book Antiqua" w:hAnsi="Book Antiqua" w:cs="Book Antiqua"/>
+          <w:rFonts w:ascii="Aptos" w:hAnsi="Aptos" w:cs="Aptos"/>
           <w:b w:val="0"/>
           <w:i w:val="0"/>
         </w:rPr>
@@ -306,24 +326,28 @@
     <w:p>
       <w:pPr>
         <w:tabs>
-          <w:tab w:pos="539" w:val="left"/>
+          <w:tab w:pos="482" w:val="left"/>
         </w:tabs>
-        <w:spacing w:before="80" w:after="80"/>
-        <w:ind w:left="539" w:hanging="539"/>
+        <w:spacing w:before="100" w:after="100"/>
+        <w:ind w:left="482" w:hanging="482"/>
       </w:pPr>
       <w:r>
         <w:rPr>
-          <w:rFonts w:ascii="Arial" w:hAnsi="Arial" w:cs="Arial"/>
-          <w:b/>
-          <w:color w:val="C62026"/>
-          <w:sz w:val="20"/>
+          <w:rFonts w:ascii="Segoe UI Symbol" w:hAnsi="Segoe UI Symbol" w:cs="Segoe UI Symbol"/>
+          <w:color w:val="002516"/>
+          <w:sz w:val="28"/>
         </w:rPr>
-        <w:t>6.</w:t>
+        <w:t>☐</w:t>
+      </w:r>
+      <w:r>
+        <w:rPr>
+          <w:rFonts w:ascii="Aptos" w:hAnsi="Aptos" w:cs="Aptos"/>
+        </w:rPr>
         <w:tab/>
       </w:r>
       <w:r>
         <w:rPr>
-          <w:rFonts w:ascii="Book Antiqua" w:hAnsi="Book Antiqua" w:cs="Book Antiqua"/>
+          <w:rFonts w:ascii="Aptos" w:hAnsi="Aptos" w:cs="Aptos"/>
           <w:b/>
           <w:i w:val="0"/>
         </w:rPr>
@@ -331,7 +355,7 @@
       </w:r>
       <w:r>
         <w:rPr>
-          <w:rFonts w:ascii="Book Antiqua" w:hAnsi="Book Antiqua" w:cs="Book Antiqua"/>
+          <w:rFonts w:ascii="Aptos" w:hAnsi="Aptos" w:cs="Aptos"/>
           <w:b w:val="0"/>
           <w:i w:val="0"/>
         </w:rPr>
@@ -341,24 +365,28 @@
     <w:p>
       <w:pPr>
         <w:tabs>
-          <w:tab w:pos="539" w:val="left"/>
+          <w:tab w:pos="482" w:val="left"/>
         </w:tabs>
-        <w:spacing w:before="80" w:after="80"/>
-        <w:ind w:left="539" w:hanging="539"/>
+        <w:spacing w:before="100" w:after="100"/>
+        <w:ind w:left="482" w:hanging="482"/>
       </w:pPr>
       <w:r>
         <w:rPr>
-          <w:rFonts w:ascii="Arial" w:hAnsi="Arial" w:cs="Arial"/>
-          <w:b/>
-          <w:color w:val="C62026"/>
-          <w:sz w:val="20"/>
+          <w:rFonts w:ascii="Segoe UI Symbol" w:hAnsi="Segoe UI Symbol" w:cs="Segoe UI Symbol"/>
+          <w:color w:val="002516"/>
+          <w:sz w:val="28"/>
         </w:rPr>
-        <w:t>7.</w:t>
+        <w:t>☐</w:t>
+      </w:r>
+      <w:r>
+        <w:rPr>
+          <w:rFonts w:ascii="Aptos" w:hAnsi="Aptos" w:cs="Aptos"/>
+        </w:rPr>
         <w:tab/>
       </w:r>
       <w:r>
         <w:rPr>
-          <w:rFonts w:ascii="Book Antiqua" w:hAnsi="Book Antiqua" w:cs="Book Antiqua"/>
+          <w:rFonts w:ascii="Aptos" w:hAnsi="Aptos" w:cs="Aptos"/>
           <w:b/>
           <w:i w:val="0"/>
         </w:rPr>
@@ -366,7 +394,7 @@
       </w:r>
       <w:r>
         <w:rPr>
-          <w:rFonts w:ascii="Book Antiqua" w:hAnsi="Book Antiqua" w:cs="Book Antiqua"/>
+          <w:rFonts w:ascii="Aptos" w:hAnsi="Aptos" w:cs="Aptos"/>
           <w:b w:val="0"/>
           <w:i w:val="0"/>
         </w:rPr>
@@ -382,7 +410,7 @@
       </w:pPr>
       <w:r>
         <w:rPr>
-          <w:rFonts w:ascii="Arial" w:hAnsi="Arial" w:cs="Arial"/>
+          <w:rFonts w:ascii="Aptos" w:hAnsi="Aptos" w:cs="Aptos"/>
           <w:b/>
           <w:i w:val="0"/>
           <w:color w:val="002516"/>
@@ -394,24 +422,28 @@
     <w:p>
       <w:pPr>
         <w:tabs>
-          <w:tab w:pos="539" w:val="left"/>
+          <w:tab w:pos="482" w:val="left"/>
         </w:tabs>
-        <w:spacing w:before="80" w:after="80"/>
-        <w:ind w:left="539" w:hanging="539"/>
+        <w:spacing w:before="100" w:after="100"/>
+        <w:ind w:left="482" w:hanging="482"/>
       </w:pPr>
       <w:r>
         <w:rPr>
-          <w:rFonts w:ascii="Arial" w:hAnsi="Arial" w:cs="Arial"/>
-          <w:b/>
-          <w:color w:val="C62026"/>
-          <w:sz w:val="20"/>
+          <w:rFonts w:ascii="Segoe UI Symbol" w:hAnsi="Segoe UI Symbol" w:cs="Segoe UI Symbol"/>
+          <w:color w:val="002516"/>
+          <w:sz w:val="28"/>
         </w:rPr>
-        <w:t>8.</w:t>
+        <w:t>☐</w:t>
+      </w:r>
+      <w:r>
+        <w:rPr>
+          <w:rFonts w:ascii="Aptos" w:hAnsi="Aptos" w:cs="Aptos"/>
+        </w:rPr>
         <w:tab/>
       </w:r>
       <w:r>
         <w:rPr>
-          <w:rFonts w:ascii="Book Antiqua" w:hAnsi="Book Antiqua" w:cs="Book Antiqua"/>
+          <w:rFonts w:ascii="Aptos" w:hAnsi="Aptos" w:cs="Aptos"/>
           <w:b w:val="0"/>
           <w:i w:val="0"/>
         </w:rPr>
@@ -421,24 +453,28 @@
     <w:p>
       <w:pPr>
         <w:tabs>
-          <w:tab w:pos="539" w:val="left"/>
+          <w:tab w:pos="482" w:val="left"/>
         </w:tabs>
-        <w:spacing w:before="80" w:after="80"/>
-        <w:ind w:left="539" w:hanging="539"/>
+        <w:spacing w:before="100" w:after="100"/>
+        <w:ind w:left="482" w:hanging="482"/>
       </w:pPr>
       <w:r>
         <w:rPr>
-          <w:rFonts w:ascii="Arial" w:hAnsi="Arial" w:cs="Arial"/>
-          <w:b/>
-          <w:color w:val="C62026"/>
-          <w:sz w:val="20"/>
+          <w:rFonts w:ascii="Segoe UI Symbol" w:hAnsi="Segoe UI Symbol" w:cs="Segoe UI Symbol"/>
+          <w:color w:val="002516"/>
+          <w:sz w:val="28"/>
         </w:rPr>
-        <w:t>9.</w:t>
+        <w:t>☐</w:t>
+      </w:r>
+      <w:r>
+        <w:rPr>
+          <w:rFonts w:ascii="Aptos" w:hAnsi="Aptos" w:cs="Aptos"/>
+        </w:rPr>
         <w:tab/>
       </w:r>
       <w:r>
         <w:rPr>
-          <w:rFonts w:ascii="Book Antiqua" w:hAnsi="Book Antiqua" w:cs="Book Antiqua"/>
+          <w:rFonts w:ascii="Aptos" w:hAnsi="Aptos" w:cs="Aptos"/>
           <w:b w:val="0"/>
           <w:i w:val="0"/>
         </w:rPr>
@@ -448,24 +484,28 @@
     <w:p>
       <w:pPr>
         <w:tabs>
-          <w:tab w:pos="539" w:val="left"/>
+          <w:tab w:pos="482" w:val="left"/>
         </w:tabs>
-        <w:spacing w:before="80" w:after="80"/>
-        <w:ind w:left="539" w:hanging="539"/>
+        <w:spacing w:before="100" w:after="100"/>
+        <w:ind w:left="482" w:hanging="482"/>
       </w:pPr>
       <w:r>
         <w:rPr>
-          <w:rFonts w:ascii="Arial" w:hAnsi="Arial" w:cs="Arial"/>
-          <w:b/>
-          <w:color w:val="C62026"/>
-          <w:sz w:val="20"/>
+          <w:rFonts w:ascii="Segoe UI Symbol" w:hAnsi="Segoe UI Symbol" w:cs="Segoe UI Symbol"/>
+          <w:color w:val="002516"/>
+          <w:sz w:val="28"/>
         </w:rPr>
-        <w:t>10.</w:t>
+        <w:t>☐</w:t>
+      </w:r>
+      <w:r>
+        <w:rPr>
+          <w:rFonts w:ascii="Aptos" w:hAnsi="Aptos" w:cs="Aptos"/>
+        </w:rPr>
         <w:tab/>
       </w:r>
       <w:r>
         <w:rPr>
-          <w:rFonts w:ascii="Book Antiqua" w:hAnsi="Book Antiqua" w:cs="Book Antiqua"/>
+          <w:rFonts w:ascii="Aptos" w:hAnsi="Aptos" w:cs="Aptos"/>
           <w:b w:val="0"/>
           <w:i w:val="0"/>
         </w:rPr>
@@ -475,24 +515,28 @@
     <w:p>
       <w:pPr>
         <w:tabs>
-          <w:tab w:pos="539" w:val="left"/>
+          <w:tab w:pos="482" w:val="left"/>
         </w:tabs>
-        <w:spacing w:before="80" w:after="80"/>
-        <w:ind w:left="539" w:hanging="539"/>
+        <w:spacing w:before="100" w:after="100"/>
+        <w:ind w:left="482" w:hanging="482"/>
       </w:pPr>
       <w:r>
         <w:rPr>
-          <w:rFonts w:ascii="Arial" w:hAnsi="Arial" w:cs="Arial"/>
-          <w:b/>
-          <w:color w:val="C62026"/>
-          <w:sz w:val="20"/>
+          <w:rFonts w:ascii="Segoe UI Symbol" w:hAnsi="Segoe UI Symbol" w:cs="Segoe UI Symbol"/>
+          <w:color w:val="002516"/>
+          <w:sz w:val="28"/>
         </w:rPr>
-        <w:t>11.</w:t>
+        <w:t>☐</w:t>
+      </w:r>
+      <w:r>
+        <w:rPr>
+          <w:rFonts w:ascii="Aptos" w:hAnsi="Aptos" w:cs="Aptos"/>
+        </w:rPr>
         <w:tab/>
       </w:r>
       <w:r>
         <w:rPr>
-          <w:rFonts w:ascii="Book Antiqua" w:hAnsi="Book Antiqua" w:cs="Book Antiqua"/>
+          <w:rFonts w:ascii="Aptos" w:hAnsi="Aptos" w:cs="Aptos"/>
           <w:b w:val="0"/>
           <w:i w:val="0"/>
         </w:rPr>
@@ -508,7 +552,7 @@
       </w:pPr>
       <w:r>
         <w:rPr>
-          <w:rFonts w:ascii="Arial" w:hAnsi="Arial" w:cs="Arial"/>
+          <w:rFonts w:ascii="Aptos" w:hAnsi="Aptos" w:cs="Aptos"/>
           <w:b/>
           <w:i w:val="0"/>
           <w:color w:val="002516"/>
@@ -520,77 +564,131 @@
     <w:p>
       <w:r>
         <w:rPr>
-          <w:rFonts w:ascii="Book Antiqua" w:hAnsi="Book Antiqua" w:cs="Book Antiqua"/>
+          <w:rFonts w:ascii="Aptos" w:hAnsi="Aptos" w:cs="Aptos"/>
           <w:b w:val="0"/>
           <w:i w:val="0"/>
         </w:rPr>
         <w:t>Once complete, record evidence of rectification and close the corresponding inspection actions.</w:t>
       </w:r>
     </w:p>
+    <w:tbl>
+      <w:tblPr>
+        <w:tblW w:type="auto" w:w="0"/>
+        <w:tblLayout w:type="fixed"/>
+        <w:tblLook w:firstColumn="1" w:firstRow="1" w:lastColumn="0" w:lastRow="0" w:noHBand="0" w:noVBand="1" w:val="04A0"/>
+      </w:tblPr>
+      <w:tblGrid>
+        <w:gridCol w:w="3099"/>
+        <w:gridCol w:w="3099"/>
+        <w:gridCol w:w="3099"/>
+      </w:tblGrid>
+      <w:tr>
+        <w:tc>
+          <w:tcPr>
+            <w:tcW w:type="dxa" w:w="3099"/>
+          </w:tcPr>
+          <w:p>
+            <w:pPr>
+              <w:spacing w:before="240" w:after="0"/>
+            </w:pPr>
+            <w:r>
+              <w:rPr>
+                <w:rFonts w:ascii="Aptos" w:hAnsi="Aptos" w:cs="Aptos"/>
+                <w:b/>
+                <w:color w:val="002516"/>
+                <w:sz w:val="18"/>
+              </w:rPr>
+              <w:t>Action Owner</w:t>
+            </w:r>
+          </w:p>
+        </w:tc>
+        <w:tc>
+          <w:tcPr>
+            <w:tcW w:type="dxa" w:w="3099"/>
+          </w:tcPr>
+          <w:p>
+            <w:pPr>
+              <w:spacing w:before="240" w:after="0"/>
+            </w:pPr>
+            <w:r>
+              <w:rPr>
+                <w:rFonts w:ascii="Aptos" w:hAnsi="Aptos" w:cs="Aptos"/>
+                <w:b/>
+                <w:color w:val="002516"/>
+                <w:sz w:val="18"/>
+              </w:rPr>
+              <w:t>Target Completion</w:t>
+            </w:r>
+          </w:p>
+        </w:tc>
+        <w:tc>
+          <w:tcPr>
+            <w:tcW w:type="dxa" w:w="3099"/>
+          </w:tcPr>
+          <w:p>
+            <w:pPr>
+              <w:spacing w:before="240" w:after="0"/>
+            </w:pPr>
+            <w:r>
+              <w:rPr>
+                <w:rFonts w:ascii="Aptos" w:hAnsi="Aptos" w:cs="Aptos"/>
+                <w:b/>
+                <w:color w:val="002516"/>
+                <w:sz w:val="18"/>
+              </w:rPr>
+              <w:t>Completion Confirmed</w:t>
+            </w:r>
+          </w:p>
+        </w:tc>
+      </w:tr>
+      <w:tr>
+        <w:tc>
+          <w:tcPr>
+            <w:tcW w:type="dxa" w:w="3099"/>
+          </w:tcPr>
+          <w:p>
+            <w:pPr>
+              <w:spacing w:before="360" w:after="0"/>
+              <w:ind w:right="340"/>
+              <w:pBdr>
+                <w:bottom w:val="single" w:sz="6" w:space="2" w:color="A89662"/>
+              </w:pBdr>
+            </w:pPr>
+          </w:p>
+        </w:tc>
+        <w:tc>
+          <w:tcPr>
+            <w:tcW w:type="dxa" w:w="3099"/>
+          </w:tcPr>
+          <w:p>
+            <w:pPr>
+              <w:spacing w:before="360" w:after="0"/>
+              <w:ind w:right="340"/>
+              <w:pBdr>
+                <w:bottom w:val="single" w:sz="6" w:space="2" w:color="A89662"/>
+              </w:pBdr>
+            </w:pPr>
+          </w:p>
+        </w:tc>
+        <w:tc>
+          <w:tcPr>
+            <w:tcW w:type="dxa" w:w="3099"/>
+          </w:tcPr>
+          <w:p>
+            <w:pPr>
+              <w:spacing w:before="360" w:after="0"/>
+              <w:ind w:right="340"/>
+              <w:pBdr>
+                <w:bottom w:val="single" w:sz="6" w:space="2" w:color="A89662"/>
+              </w:pBdr>
+            </w:pPr>
+          </w:p>
+        </w:tc>
+      </w:tr>
+    </w:tbl>
     <w:p>
       <w:pPr>
-        <w:spacing w:before="280" w:after="0"/>
-      </w:pPr>
-      <w:r>
-        <w:rPr>
-          <w:rFonts w:ascii="Arial" w:hAnsi="Arial" w:cs="Arial"/>
-          <w:b/>
-          <w:color w:val="002516"/>
-          <w:sz w:val="18"/>
-        </w:rPr>
-        <w:t>Action Owner</w:t>
-      </w:r>
-    </w:p>
-    <w:p>
-      <w:pPr>
-        <w:spacing w:before="320" w:after="0"/>
-        <w:pBdr>
-          <w:bottom w:val="single" w:sz="6" w:space="2" w:color="A89662"/>
-        </w:pBdr>
-      </w:pPr>
-    </w:p>
-    <w:p>
-      <w:pPr>
-        <w:spacing w:before="280" w:after="0"/>
-      </w:pPr>
-      <w:r>
-        <w:rPr>
-          <w:rFonts w:ascii="Arial" w:hAnsi="Arial" w:cs="Arial"/>
-          <w:b/>
-          <w:color w:val="002516"/>
-          <w:sz w:val="18"/>
-        </w:rPr>
-        <w:t>Target Completion</w:t>
-      </w:r>
-    </w:p>
-    <w:p>
-      <w:pPr>
-        <w:spacing w:before="320" w:after="0"/>
-        <w:pBdr>
-          <w:bottom w:val="single" w:sz="6" w:space="2" w:color="A89662"/>
-        </w:pBdr>
-      </w:pPr>
-    </w:p>
-    <w:p>
-      <w:pPr>
-        <w:spacing w:before="280" w:after="0"/>
-      </w:pPr>
-      <w:r>
-        <w:rPr>
-          <w:rFonts w:ascii="Arial" w:hAnsi="Arial" w:cs="Arial"/>
-          <w:b/>
-          <w:color w:val="002516"/>
-          <w:sz w:val="18"/>
-        </w:rPr>
-        <w:t>Completion Confirmed</w:t>
-      </w:r>
-    </w:p>
-    <w:p>
-      <w:pPr>
-        <w:spacing w:before="320" w:after="0"/>
-        <w:pBdr>
-          <w:bottom w:val="single" w:sz="6" w:space="2" w:color="A89662"/>
-        </w:pBdr>
+        <w:spacing w:after="0"/>
       </w:pPr>
     </w:p>
     <w:sectPr>
@@ -616,7 +714,7 @@
     <w:r/>
     <w:r>
       <w:rPr>
-        <w:rFonts w:ascii="Arial" w:hAnsi="Arial" w:cs="Arial"/>
+        <w:rFonts w:ascii="Aptos" w:hAnsi="Aptos" w:cs="Aptos"/>
         <w:b/>
         <w:color w:val="000000"/>
         <w:sz w:val="20"/>
@@ -634,7 +732,7 @@
     </w:pPr>
     <w:r>
       <w:rPr>
-        <w:rFonts w:ascii="Arial" w:hAnsi="Arial" w:cs="Arial"/>
+        <w:rFonts w:ascii="Aptos" w:hAnsi="Aptos" w:cs="Aptos"/>
         <w:color w:val="000000"/>
         <w:sz w:val="17"/>
       </w:rPr>
@@ -642,7 +740,7 @@
     </w:r>
     <w:r>
       <w:rPr>
-        <w:rFonts w:ascii="Arial" w:hAnsi="Arial" w:cs="Arial"/>
+        <w:rFonts w:ascii="Aptos" w:hAnsi="Aptos" w:cs="Aptos"/>
         <w:color w:val="000000"/>
         <w:sz w:val="17"/>
       </w:rPr>
@@ -650,7 +748,7 @@
     </w:r>
     <w:r>
       <w:rPr>
-        <w:rFonts w:ascii="Arial" w:hAnsi="Arial" w:cs="Arial"/>
+        <w:rFonts w:ascii="Aptos" w:hAnsi="Aptos" w:cs="Aptos"/>
         <w:color w:val="000000"/>
         <w:sz w:val="17"/>
       </w:rPr>
@@ -658,7 +756,7 @@
     </w:r>
     <w:r>
       <w:rPr>
-        <w:rFonts w:ascii="Arial" w:hAnsi="Arial" w:cs="Arial"/>
+        <w:rFonts w:ascii="Aptos" w:hAnsi="Aptos" w:cs="Aptos"/>
         <w:color w:val="000000"/>
         <w:sz w:val="17"/>
       </w:rPr>
@@ -667,42 +765,42 @@
     </w:r>
     <w:r>
       <w:rPr>
-        <w:rFonts w:ascii="Arial" w:hAnsi="Arial" w:cs="Arial"/>
+        <w:rFonts w:ascii="Aptos" w:hAnsi="Aptos" w:cs="Aptos"/>
         <w:sz w:val="17"/>
       </w:rPr>
       <w:fldChar w:fldCharType="begin"/>
     </w:r>
     <w:r>
       <w:rPr>
-        <w:rFonts w:ascii="Arial" w:hAnsi="Arial" w:cs="Arial"/>
+        <w:rFonts w:ascii="Aptos" w:hAnsi="Aptos" w:cs="Aptos"/>
         <w:sz w:val="17"/>
       </w:rPr>
       <w:instrText xml:space="preserve"> PAGE </w:instrText>
     </w:r>
     <w:r>
       <w:rPr>
-        <w:rFonts w:ascii="Arial" w:hAnsi="Arial" w:cs="Arial"/>
+        <w:rFonts w:ascii="Aptos" w:hAnsi="Aptos" w:cs="Aptos"/>
         <w:sz w:val="17"/>
       </w:rPr>
       <w:fldChar w:fldCharType="separate"/>
     </w:r>
     <w:r>
       <w:rPr>
-        <w:rFonts w:ascii="Arial" w:hAnsi="Arial" w:cs="Arial"/>
+        <w:rFonts w:ascii="Aptos" w:hAnsi="Aptos" w:cs="Aptos"/>
         <w:sz w:val="17"/>
       </w:rPr>
       <w:t>1</w:t>
     </w:r>
     <w:r>
       <w:rPr>
-        <w:rFonts w:ascii="Arial" w:hAnsi="Arial" w:cs="Arial"/>
+        <w:rFonts w:ascii="Aptos" w:hAnsi="Aptos" w:cs="Aptos"/>
         <w:sz w:val="17"/>
       </w:rPr>
       <w:fldChar w:fldCharType="end"/>
     </w:r>
     <w:r>
       <w:rPr>
-        <w:rFonts w:ascii="Arial" w:hAnsi="Arial" w:cs="Arial"/>
+        <w:rFonts w:ascii="Aptos" w:hAnsi="Aptos" w:cs="Aptos"/>
         <w:color w:val="000000"/>
         <w:sz w:val="17"/>
       </w:rPr>
@@ -710,35 +808,35 @@
     </w:r>
     <w:r>
       <w:rPr>
-        <w:rFonts w:ascii="Arial" w:hAnsi="Arial" w:cs="Arial"/>
+        <w:rFonts w:ascii="Aptos" w:hAnsi="Aptos" w:cs="Aptos"/>
         <w:sz w:val="17"/>
       </w:rPr>
       <w:fldChar w:fldCharType="begin"/>
     </w:r>
     <w:r>
       <w:rPr>
-        <w:rFonts w:ascii="Arial" w:hAnsi="Arial" w:cs="Arial"/>
+        <w:rFonts w:ascii="Aptos" w:hAnsi="Aptos" w:cs="Aptos"/>
         <w:sz w:val="17"/>
       </w:rPr>
       <w:instrText xml:space="preserve"> NUMPAGES </w:instrText>
     </w:r>
     <w:r>
       <w:rPr>
-        <w:rFonts w:ascii="Arial" w:hAnsi="Arial" w:cs="Arial"/>
+        <w:rFonts w:ascii="Aptos" w:hAnsi="Aptos" w:cs="Aptos"/>
         <w:sz w:val="17"/>
       </w:rPr>
       <w:fldChar w:fldCharType="separate"/>
     </w:r>
     <w:r>
       <w:rPr>
-        <w:rFonts w:ascii="Arial" w:hAnsi="Arial" w:cs="Arial"/>
+        <w:rFonts w:ascii="Aptos" w:hAnsi="Aptos" w:cs="Aptos"/>
         <w:sz w:val="17"/>
       </w:rPr>
       <w:t>1</w:t>
     </w:r>
     <w:r>
       <w:rPr>
-        <w:rFonts w:ascii="Arial" w:hAnsi="Arial" w:cs="Arial"/>
+        <w:rFonts w:ascii="Aptos" w:hAnsi="Aptos" w:cs="Aptos"/>
         <w:sz w:val="17"/>
       </w:rPr>
       <w:fldChar w:fldCharType="end"/>
@@ -758,7 +856,7 @@
     <w:r/>
     <w:r>
       <w:rPr>
-        <w:rFonts w:ascii="Arial" w:hAnsi="Arial" w:cs="Arial"/>
+        <w:rFonts w:ascii="Aptos" w:hAnsi="Aptos" w:cs="Aptos"/>
         <w:b/>
         <w:color w:val="000000"/>
         <w:sz w:val="20"/>
@@ -977,7 +1075,7 @@
   <w:docDefaults>
     <w:rPrDefault>
       <w:rPr>
-        <w:rFonts w:ascii="Book Antiqua" w:hAnsi="Book Antiqua" w:cs="Book Antiqua"/>
+        <w:rFonts w:ascii="Aptos" w:hAnsi="Aptos" w:cs="Aptos"/>
         <w:sz w:val="22"/>
         <w:szCs w:val="22"/>
         <w:lang w:val="en-US" w:eastAsia="en-US" w:bidi="ar-SA"/>
@@ -1137,7 +1235,7 @@
       <w:jc w:val="left"/>
     </w:pPr>
     <w:rPr>
-      <w:rFonts w:ascii="Book Antiqua" w:hAnsi="Book Antiqua" w:cs="Book Antiqua"/>
+      <w:rFonts w:ascii="Aptos" w:hAnsi="Aptos" w:cs="Aptos"/>
       <w:color w:val="000000"/>
       <w:sz w:val="21"/>
     </w:rPr>
@@ -1187,7 +1285,7 @@
       <w:outlineLvl w:val="0"/>
     </w:pPr>
     <w:rPr>
-      <w:rFonts w:ascii="Book Antiqua" w:hAnsi="Book Antiqua" w:cs="Book Antiqua"/>
+      <w:rFonts w:ascii="Aptos" w:hAnsi="Aptos" w:cs="Aptos"/>
       <w:b/>
       <w:color w:val="002516"/>
       <w:sz w:val="24"/>

</xml_diff>